<commit_message>
feat(TA): update main docs file, add tmp file
</commit_message>
<xml_diff>
--- a/Теория автоматов и формальных языков/Lab2/docks/L2.docx
+++ b/Теория автоматов и формальных языков/Lab2/docks/L2.docx
@@ -9,15 +9,15 @@
         <w:jc w:val="start"/>
         <w:rPr>
           <w:highlight w:val="none"/>
-          <w:shd w:fill="auto" w:val="clear"/>
-        </w:rPr>
-      </w:pPr>
-      <w:r>
-        <w:rPr>
-          <w:rFonts w:ascii="times" w:hAnsi="times"/>
-          <w:sz w:val="20"/>
-          <w:szCs w:val="20"/>
-          <w:shd w:fill="auto" w:val="clear"/>
+          <w:shd w:fill="ADFF2F" w:val="clear"/>
+        </w:rPr>
+      </w:pPr>
+      <w:r>
+        <w:rPr>
+          <w:rFonts w:ascii="times" w:hAnsi="times"/>
+          <w:sz w:val="20"/>
+          <w:szCs w:val="20"/>
+          <w:shd w:fill="ADFF2F" w:val="clear"/>
         </w:rPr>
         <w:t>Вариант 8</w:t>
       </w:r>
@@ -32,34 +32,34 @@
           <w:sz w:val="20"/>
           <w:szCs w:val="20"/>
           <w:highlight w:val="none"/>
-          <w:shd w:fill="auto" w:val="clear"/>
-        </w:rPr>
-      </w:pPr>
-      <w:r>
-        <w:rPr>
-          <w:rFonts w:ascii="times" w:hAnsi="times"/>
-          <w:sz w:val="20"/>
-          <w:szCs w:val="20"/>
-          <w:shd w:fill="auto" w:val="clear"/>
-        </w:rPr>
-      </w:r>
-    </w:p>
-    <w:p>
-      <w:pPr>
-        <w:pStyle w:val="Normal"/>
-        <w:bidi w:val="0"/>
-        <w:jc w:val="start"/>
-        <w:rPr>
-          <w:highlight w:val="none"/>
-          <w:shd w:fill="auto" w:val="clear"/>
-        </w:rPr>
-      </w:pPr>
-      <w:r>
-        <w:rPr>
-          <w:rFonts w:ascii="times" w:hAnsi="times"/>
-          <w:sz w:val="20"/>
-          <w:szCs w:val="20"/>
-          <w:shd w:fill="auto" w:val="clear"/>
+          <w:shd w:fill="ADFF2F" w:val="clear"/>
+        </w:rPr>
+      </w:pPr>
+      <w:r>
+        <w:rPr>
+          <w:rFonts w:ascii="times" w:hAnsi="times"/>
+          <w:sz w:val="20"/>
+          <w:szCs w:val="20"/>
+          <w:shd w:fill="ADFF2F" w:val="clear"/>
+        </w:rPr>
+      </w:r>
+    </w:p>
+    <w:p>
+      <w:pPr>
+        <w:pStyle w:val="Normal"/>
+        <w:bidi w:val="0"/>
+        <w:jc w:val="start"/>
+        <w:rPr>
+          <w:highlight w:val="none"/>
+          <w:shd w:fill="ADFF2F" w:val="clear"/>
+        </w:rPr>
+      </w:pPr>
+      <w:r>
+        <w:rPr>
+          <w:rFonts w:ascii="times" w:hAnsi="times"/>
+          <w:sz w:val="20"/>
+          <w:szCs w:val="20"/>
+          <w:shd w:fill="ADFF2F" w:val="clear"/>
         </w:rPr>
         <w:t>1. T→ abETP</w:t>
       </w:r>
@@ -71,15 +71,15 @@
         <w:jc w:val="start"/>
         <w:rPr>
           <w:highlight w:val="none"/>
-          <w:shd w:fill="auto" w:val="clear"/>
-        </w:rPr>
-      </w:pPr>
-      <w:r>
-        <w:rPr>
-          <w:rFonts w:ascii="times" w:hAnsi="times"/>
-          <w:sz w:val="20"/>
-          <w:szCs w:val="20"/>
-          <w:shd w:fill="auto" w:val="clear"/>
+          <w:shd w:fill="ADFF2F" w:val="clear"/>
+        </w:rPr>
+      </w:pPr>
+      <w:r>
+        <w:rPr>
+          <w:rFonts w:ascii="times" w:hAnsi="times"/>
+          <w:sz w:val="20"/>
+          <w:szCs w:val="20"/>
+          <w:shd w:fill="ADFF2F" w:val="clear"/>
         </w:rPr>
         <w:t>2. T→ aDE</w:t>
       </w:r>
@@ -91,15 +91,15 @@
         <w:jc w:val="start"/>
         <w:rPr>
           <w:highlight w:val="none"/>
-          <w:shd w:fill="auto" w:val="clear"/>
-        </w:rPr>
-      </w:pPr>
-      <w:r>
-        <w:rPr>
-          <w:rFonts w:ascii="times" w:hAnsi="times"/>
-          <w:sz w:val="20"/>
-          <w:szCs w:val="20"/>
-          <w:shd w:fill="auto" w:val="clear"/>
+          <w:shd w:fill="ADFF2F" w:val="clear"/>
+        </w:rPr>
+      </w:pPr>
+      <w:r>
+        <w:rPr>
+          <w:rFonts w:ascii="times" w:hAnsi="times"/>
+          <w:sz w:val="20"/>
+          <w:szCs w:val="20"/>
+          <w:shd w:fill="ADFF2F" w:val="clear"/>
         </w:rPr>
         <w:t>3. T→ В</w:t>
       </w:r>
@@ -111,15 +111,15 @@
         <w:jc w:val="start"/>
         <w:rPr>
           <w:highlight w:val="none"/>
-          <w:shd w:fill="auto" w:val="clear"/>
-        </w:rPr>
-      </w:pPr>
-      <w:r>
-        <w:rPr>
-          <w:rFonts w:ascii="times" w:hAnsi="times"/>
-          <w:sz w:val="20"/>
-          <w:szCs w:val="20"/>
-          <w:shd w:fill="auto" w:val="clear"/>
+          <w:shd w:fill="ADFF2F" w:val="clear"/>
+        </w:rPr>
+      </w:pPr>
+      <w:r>
+        <w:rPr>
+          <w:rFonts w:ascii="times" w:hAnsi="times"/>
+          <w:sz w:val="20"/>
+          <w:szCs w:val="20"/>
+          <w:shd w:fill="ADFF2F" w:val="clear"/>
         </w:rPr>
         <w:t>4. D→ TAb</w:t>
       </w:r>
@@ -131,15 +131,15 @@
         <w:jc w:val="start"/>
         <w:rPr>
           <w:highlight w:val="none"/>
-          <w:shd w:fill="auto" w:val="clear"/>
-        </w:rPr>
-      </w:pPr>
-      <w:r>
-        <w:rPr>
-          <w:rFonts w:ascii="times" w:hAnsi="times"/>
-          <w:sz w:val="20"/>
-          <w:szCs w:val="20"/>
-          <w:shd w:fill="auto" w:val="clear"/>
+          <w:shd w:fill="ADFF2F" w:val="clear"/>
+        </w:rPr>
+      </w:pPr>
+      <w:r>
+        <w:rPr>
+          <w:rFonts w:ascii="times" w:hAnsi="times"/>
+          <w:sz w:val="20"/>
+          <w:szCs w:val="20"/>
+          <w:shd w:fill="ADFF2F" w:val="clear"/>
         </w:rPr>
         <w:t>5. D→ b</w:t>
       </w:r>
@@ -151,23 +151,23 @@
         <w:jc w:val="start"/>
         <w:rPr>
           <w:highlight w:val="none"/>
-          <w:shd w:fill="auto" w:val="clear"/>
-        </w:rPr>
-      </w:pPr>
-      <w:r>
-        <w:rPr>
-          <w:rFonts w:ascii="times" w:hAnsi="times"/>
-          <w:sz w:val="20"/>
-          <w:szCs w:val="20"/>
-          <w:shd w:fill="auto" w:val="clear"/>
-        </w:rPr>
-        <w:t>6. E→</w:t>
-      </w:r>
-      <w:r>
-        <w:rPr>
-          <w:sz w:val="20"/>
-          <w:szCs w:val="20"/>
-          <w:shd w:fill="auto" w:val="clear"/>
+          <w:shd w:fill="ADFF2F" w:val="clear"/>
+        </w:rPr>
+      </w:pPr>
+      <w:r>
+        <w:rPr>
+          <w:rFonts w:ascii="times" w:hAnsi="times"/>
+          <w:sz w:val="20"/>
+          <w:szCs w:val="20"/>
+          <w:shd w:fill="ADFF2F" w:val="clear"/>
+        </w:rPr>
+        <w:t>6. E→</w:t>
+      </w:r>
+      <w:r>
+        <w:rPr>
+          <w:sz w:val="20"/>
+          <w:szCs w:val="20"/>
+          <w:shd w:fill="ADFF2F" w:val="clear"/>
         </w:rPr>
         <w:t>ε</w:t>
       </w:r>
@@ -179,15 +179,15 @@
         <w:jc w:val="start"/>
         <w:rPr>
           <w:highlight w:val="none"/>
-          <w:shd w:fill="auto" w:val="clear"/>
-        </w:rPr>
-      </w:pPr>
-      <w:r>
-        <w:rPr>
-          <w:rFonts w:ascii="times" w:hAnsi="times"/>
-          <w:sz w:val="20"/>
-          <w:szCs w:val="20"/>
-          <w:shd w:fill="auto" w:val="clear"/>
+          <w:shd w:fill="ADFF2F" w:val="clear"/>
+        </w:rPr>
+      </w:pPr>
+      <w:r>
+        <w:rPr>
+          <w:rFonts w:ascii="times" w:hAnsi="times"/>
+          <w:sz w:val="20"/>
+          <w:szCs w:val="20"/>
+          <w:shd w:fill="ADFF2F" w:val="clear"/>
         </w:rPr>
         <w:t>7. P→ BCa</w:t>
       </w:r>
@@ -199,15 +199,15 @@
         <w:jc w:val="start"/>
         <w:rPr>
           <w:highlight w:val="none"/>
-          <w:shd w:fill="auto" w:val="clear"/>
-        </w:rPr>
-      </w:pPr>
-      <w:r>
-        <w:rPr>
-          <w:rFonts w:ascii="times" w:hAnsi="times"/>
-          <w:sz w:val="20"/>
-          <w:szCs w:val="20"/>
-          <w:shd w:fill="auto" w:val="clear"/>
+          <w:shd w:fill="ADFF2F" w:val="clear"/>
+        </w:rPr>
+      </w:pPr>
+      <w:r>
+        <w:rPr>
+          <w:rFonts w:ascii="times" w:hAnsi="times"/>
+          <w:sz w:val="20"/>
+          <w:szCs w:val="20"/>
+          <w:shd w:fill="ADFF2F" w:val="clear"/>
         </w:rPr>
         <w:t>8. P→ Cb</w:t>
       </w:r>
@@ -219,15 +219,15 @@
         <w:jc w:val="start"/>
         <w:rPr>
           <w:highlight w:val="none"/>
-          <w:shd w:fill="auto" w:val="clear"/>
-        </w:rPr>
-      </w:pPr>
-      <w:r>
-        <w:rPr>
-          <w:rFonts w:ascii="times" w:hAnsi="times"/>
-          <w:sz w:val="20"/>
-          <w:szCs w:val="20"/>
-          <w:shd w:fill="auto" w:val="clear"/>
+          <w:shd w:fill="ADFF2F" w:val="clear"/>
+        </w:rPr>
+      </w:pPr>
+      <w:r>
+        <w:rPr>
+          <w:rFonts w:ascii="times" w:hAnsi="times"/>
+          <w:sz w:val="20"/>
+          <w:szCs w:val="20"/>
+          <w:shd w:fill="ADFF2F" w:val="clear"/>
         </w:rPr>
         <w:t>9. C→ abC</w:t>
       </w:r>
@@ -239,15 +239,15 @@
         <w:jc w:val="start"/>
         <w:rPr>
           <w:highlight w:val="none"/>
-          <w:shd w:fill="auto" w:val="clear"/>
-        </w:rPr>
-      </w:pPr>
-      <w:r>
-        <w:rPr>
-          <w:rFonts w:ascii="times" w:hAnsi="times"/>
-          <w:sz w:val="20"/>
-          <w:szCs w:val="20"/>
-          <w:shd w:fill="auto" w:val="clear"/>
+          <w:shd w:fill="ADFF2F" w:val="clear"/>
+        </w:rPr>
+      </w:pPr>
+      <w:r>
+        <w:rPr>
+          <w:rFonts w:ascii="times" w:hAnsi="times"/>
+          <w:sz w:val="20"/>
+          <w:szCs w:val="20"/>
+          <w:shd w:fill="ADFF2F" w:val="clear"/>
         </w:rPr>
         <w:t>10. A→ Bbb</w:t>
       </w:r>
@@ -259,15 +259,15 @@
         <w:jc w:val="start"/>
         <w:rPr>
           <w:highlight w:val="none"/>
-          <w:shd w:fill="auto" w:val="clear"/>
-        </w:rPr>
-      </w:pPr>
-      <w:r>
-        <w:rPr>
-          <w:rFonts w:ascii="times" w:hAnsi="times"/>
-          <w:sz w:val="20"/>
-          <w:szCs w:val="20"/>
-          <w:shd w:fill="auto" w:val="clear"/>
+          <w:shd w:fill="ADFF2F" w:val="clear"/>
+        </w:rPr>
+      </w:pPr>
+      <w:r>
+        <w:rPr>
+          <w:rFonts w:ascii="times" w:hAnsi="times"/>
+          <w:sz w:val="20"/>
+          <w:szCs w:val="20"/>
+          <w:shd w:fill="ADFF2F" w:val="clear"/>
         </w:rPr>
         <w:t>11. B→ aECb</w:t>
       </w:r>
@@ -279,15 +279,15 @@
         <w:jc w:val="start"/>
         <w:rPr>
           <w:highlight w:val="none"/>
-          <w:shd w:fill="auto" w:val="clear"/>
-        </w:rPr>
-      </w:pPr>
-      <w:r>
-        <w:rPr>
-          <w:rFonts w:ascii="times" w:hAnsi="times"/>
-          <w:sz w:val="20"/>
-          <w:szCs w:val="20"/>
-          <w:shd w:fill="auto" w:val="clear"/>
+          <w:shd w:fill="ADFF2F" w:val="clear"/>
+        </w:rPr>
+      </w:pPr>
+      <w:r>
+        <w:rPr>
+          <w:rFonts w:ascii="times" w:hAnsi="times"/>
+          <w:sz w:val="20"/>
+          <w:szCs w:val="20"/>
+          <w:shd w:fill="ADFF2F" w:val="clear"/>
         </w:rPr>
         <w:t>12. B→ D</w:t>
       </w:r>
@@ -302,26 +302,26 @@
           <w:sz w:val="20"/>
           <w:szCs w:val="20"/>
           <w:highlight w:val="none"/>
-          <w:shd w:fill="auto" w:val="clear"/>
-        </w:rPr>
-      </w:pPr>
-      <w:r>
-        <w:rPr>
-          <w:rFonts w:ascii="times" w:hAnsi="times"/>
-          <w:sz w:val="20"/>
-          <w:szCs w:val="20"/>
-          <w:shd w:fill="auto" w:val="clear"/>
-        </w:rPr>
-      </w:r>
-    </w:p>
-    <w:p>
-      <w:pPr>
-        <w:pStyle w:val="Normal"/>
-        <w:bidi w:val="0"/>
-        <w:jc w:val="start"/>
-        <w:rPr>
-          <w:highlight w:val="none"/>
-          <w:shd w:fill="auto" w:val="clear"/>
+          <w:shd w:fill="ADFF2F" w:val="clear"/>
+        </w:rPr>
+      </w:pPr>
+      <w:r>
+        <w:rPr>
+          <w:rFonts w:ascii="times" w:hAnsi="times"/>
+          <w:sz w:val="20"/>
+          <w:szCs w:val="20"/>
+          <w:shd w:fill="ADFF2F" w:val="clear"/>
+        </w:rPr>
+      </w:r>
+    </w:p>
+    <w:p>
+      <w:pPr>
+        <w:pStyle w:val="Normal"/>
+        <w:bidi w:val="0"/>
+        <w:jc w:val="start"/>
+        <w:rPr>
+          <w:highlight w:val="none"/>
+          <w:shd w:fill="ADFF2F" w:val="clear"/>
         </w:rPr>
       </w:pPr>
       <w:r>
@@ -331,7 +331,7 @@
           <w:bCs/>
           <w:sz w:val="20"/>
           <w:szCs w:val="20"/>
-          <w:shd w:fill="auto" w:val="clear"/>
+          <w:shd w:fill="ADFF2F" w:val="clear"/>
         </w:rPr>
         <w:t>1. Преобразовать исходную грамматику G (см. варианты заданий) в грамматику G1 без лишних символов.</w:t>
       </w:r>
@@ -343,15 +343,15 @@
         <w:jc w:val="start"/>
         <w:rPr>
           <w:highlight w:val="none"/>
-          <w:shd w:fill="auto" w:val="clear"/>
-        </w:rPr>
-      </w:pPr>
-      <w:r>
-        <w:rPr>
-          <w:rFonts w:ascii="times" w:hAnsi="times"/>
-          <w:sz w:val="20"/>
-          <w:szCs w:val="20"/>
-          <w:shd w:fill="auto" w:val="clear"/>
+          <w:shd w:fill="ADFF2F" w:val="clear"/>
+        </w:rPr>
+      </w:pPr>
+      <w:r>
+        <w:rPr>
+          <w:rFonts w:ascii="times" w:hAnsi="times"/>
+          <w:sz w:val="20"/>
+          <w:szCs w:val="20"/>
+          <w:shd w:fill="ADFF2F" w:val="clear"/>
         </w:rPr>
         <w:t>N = {T,  D, E, P, C, A, B} нетерминалы</w:t>
       </w:r>
@@ -363,15 +363,15 @@
         <w:jc w:val="start"/>
         <w:rPr>
           <w:highlight w:val="none"/>
-          <w:shd w:fill="auto" w:val="clear"/>
-        </w:rPr>
-      </w:pPr>
-      <w:r>
-        <w:rPr>
-          <w:rFonts w:ascii="times" w:hAnsi="times"/>
-          <w:sz w:val="20"/>
-          <w:szCs w:val="20"/>
-          <w:shd w:fill="auto" w:val="clear"/>
+          <w:shd w:fill="ADFF2F" w:val="clear"/>
+        </w:rPr>
+      </w:pPr>
+      <w:r>
+        <w:rPr>
+          <w:rFonts w:ascii="times" w:hAnsi="times"/>
+          <w:sz w:val="20"/>
+          <w:szCs w:val="20"/>
+          <w:shd w:fill="ADFF2F" w:val="clear"/>
         </w:rPr>
         <w:t>P = {D, E, T, B, A} продуктивные</w:t>
       </w:r>
@@ -383,15 +383,15 @@
         <w:jc w:val="start"/>
         <w:rPr>
           <w:highlight w:val="none"/>
-          <w:shd w:fill="auto" w:val="clear"/>
-        </w:rPr>
-      </w:pPr>
-      <w:r>
-        <w:rPr>
-          <w:rFonts w:ascii="times" w:hAnsi="times"/>
-          <w:sz w:val="20"/>
-          <w:szCs w:val="20"/>
-          <w:shd w:fill="auto" w:val="clear"/>
+          <w:shd w:fill="ADFF2F" w:val="clear"/>
+        </w:rPr>
+      </w:pPr>
+      <w:r>
+        <w:rPr>
+          <w:rFonts w:ascii="times" w:hAnsi="times"/>
+          <w:sz w:val="20"/>
+          <w:szCs w:val="20"/>
+          <w:shd w:fill="ADFF2F" w:val="clear"/>
         </w:rPr>
         <w:t>N — P = {P, C} бесплодные</w:t>
       </w:r>
@@ -403,15 +403,15 @@
         <w:jc w:val="start"/>
         <w:rPr>
           <w:highlight w:val="none"/>
-          <w:shd w:fill="auto" w:val="clear"/>
-        </w:rPr>
-      </w:pPr>
-      <w:r>
-        <w:rPr>
-          <w:rFonts w:ascii="times" w:hAnsi="times"/>
-          <w:sz w:val="20"/>
-          <w:szCs w:val="20"/>
-          <w:shd w:fill="auto" w:val="clear"/>
+          <w:shd w:fill="ADFF2F" w:val="clear"/>
+        </w:rPr>
+      </w:pPr>
+      <w:r>
+        <w:rPr>
+          <w:rFonts w:ascii="times" w:hAnsi="times"/>
+          <w:sz w:val="20"/>
+          <w:szCs w:val="20"/>
+          <w:shd w:fill="ADFF2F" w:val="clear"/>
         </w:rPr>
         <w:t>исключаем правила (1, 7, 8, 9, 11)</w:t>
       </w:r>
@@ -426,34 +426,34 @@
           <w:sz w:val="20"/>
           <w:szCs w:val="20"/>
           <w:highlight w:val="none"/>
-          <w:shd w:fill="auto" w:val="clear"/>
-        </w:rPr>
-      </w:pPr>
-      <w:r>
-        <w:rPr>
-          <w:rFonts w:ascii="times" w:hAnsi="times"/>
-          <w:sz w:val="20"/>
-          <w:szCs w:val="20"/>
-          <w:shd w:fill="auto" w:val="clear"/>
-        </w:rPr>
-      </w:r>
-    </w:p>
-    <w:p>
-      <w:pPr>
-        <w:pStyle w:val="Normal"/>
-        <w:bidi w:val="0"/>
-        <w:jc w:val="start"/>
-        <w:rPr>
-          <w:highlight w:val="none"/>
-          <w:shd w:fill="auto" w:val="clear"/>
-        </w:rPr>
-      </w:pPr>
-      <w:r>
-        <w:rPr>
-          <w:rFonts w:ascii="times" w:hAnsi="times"/>
-          <w:sz w:val="20"/>
-          <w:szCs w:val="20"/>
-          <w:shd w:fill="auto" w:val="clear"/>
+          <w:shd w:fill="ADFF2F" w:val="clear"/>
+        </w:rPr>
+      </w:pPr>
+      <w:r>
+        <w:rPr>
+          <w:rFonts w:ascii="times" w:hAnsi="times"/>
+          <w:sz w:val="20"/>
+          <w:szCs w:val="20"/>
+          <w:shd w:fill="ADFF2F" w:val="clear"/>
+        </w:rPr>
+      </w:r>
+    </w:p>
+    <w:p>
+      <w:pPr>
+        <w:pStyle w:val="Normal"/>
+        <w:bidi w:val="0"/>
+        <w:jc w:val="start"/>
+        <w:rPr>
+          <w:highlight w:val="none"/>
+          <w:shd w:fill="ADFF2F" w:val="clear"/>
+        </w:rPr>
+      </w:pPr>
+      <w:r>
+        <w:rPr>
+          <w:rFonts w:ascii="times" w:hAnsi="times"/>
+          <w:sz w:val="20"/>
+          <w:szCs w:val="20"/>
+          <w:shd w:fill="ADFF2F" w:val="clear"/>
         </w:rPr>
         <w:t>получим:</w:t>
       </w:r>
@@ -465,7 +465,7 @@
         <w:jc w:val="start"/>
         <w:rPr>
           <w:highlight w:val="none"/>
-          <w:shd w:fill="auto" w:val="clear"/>
+          <w:shd w:fill="ADFF2F" w:val="clear"/>
         </w:rPr>
       </w:pPr>
       <w:r>
@@ -475,7 +475,7 @@
           <w:bCs/>
           <w:sz w:val="20"/>
           <w:szCs w:val="20"/>
-          <w:shd w:fill="auto" w:val="clear"/>
+          <w:shd w:fill="ADFF2F" w:val="clear"/>
         </w:rPr>
         <w:t>G1:</w:t>
       </w:r>
@@ -487,15 +487,15 @@
         <w:jc w:val="start"/>
         <w:rPr>
           <w:highlight w:val="none"/>
-          <w:shd w:fill="auto" w:val="clear"/>
-        </w:rPr>
-      </w:pPr>
-      <w:r>
-        <w:rPr>
-          <w:rFonts w:ascii="times" w:hAnsi="times"/>
-          <w:sz w:val="20"/>
-          <w:szCs w:val="20"/>
-          <w:shd w:fill="auto" w:val="clear"/>
+          <w:shd w:fill="ADFF2F" w:val="clear"/>
+        </w:rPr>
+      </w:pPr>
+      <w:r>
+        <w:rPr>
+          <w:rFonts w:ascii="times" w:hAnsi="times"/>
+          <w:sz w:val="20"/>
+          <w:szCs w:val="20"/>
+          <w:shd w:fill="ADFF2F" w:val="clear"/>
         </w:rPr>
         <w:t>1. T→ aDE</w:t>
       </w:r>
@@ -507,15 +507,15 @@
         <w:jc w:val="start"/>
         <w:rPr>
           <w:highlight w:val="none"/>
-          <w:shd w:fill="auto" w:val="clear"/>
-        </w:rPr>
-      </w:pPr>
-      <w:r>
-        <w:rPr>
-          <w:rFonts w:ascii="times" w:hAnsi="times"/>
-          <w:sz w:val="20"/>
-          <w:szCs w:val="20"/>
-          <w:shd w:fill="auto" w:val="clear"/>
+          <w:shd w:fill="ADFF2F" w:val="clear"/>
+        </w:rPr>
+      </w:pPr>
+      <w:r>
+        <w:rPr>
+          <w:rFonts w:ascii="times" w:hAnsi="times"/>
+          <w:sz w:val="20"/>
+          <w:szCs w:val="20"/>
+          <w:shd w:fill="ADFF2F" w:val="clear"/>
         </w:rPr>
         <w:t>2. T→ В</w:t>
       </w:r>
@@ -527,15 +527,15 @@
         <w:jc w:val="start"/>
         <w:rPr>
           <w:highlight w:val="none"/>
-          <w:shd w:fill="auto" w:val="clear"/>
-        </w:rPr>
-      </w:pPr>
-      <w:r>
-        <w:rPr>
-          <w:rFonts w:ascii="times" w:hAnsi="times"/>
-          <w:sz w:val="20"/>
-          <w:szCs w:val="20"/>
-          <w:shd w:fill="auto" w:val="clear"/>
+          <w:shd w:fill="ADFF2F" w:val="clear"/>
+        </w:rPr>
+      </w:pPr>
+      <w:r>
+        <w:rPr>
+          <w:rFonts w:ascii="times" w:hAnsi="times"/>
+          <w:sz w:val="20"/>
+          <w:szCs w:val="20"/>
+          <w:shd w:fill="ADFF2F" w:val="clear"/>
         </w:rPr>
         <w:t>3. D→ TAb</w:t>
       </w:r>
@@ -547,15 +547,15 @@
         <w:jc w:val="start"/>
         <w:rPr>
           <w:highlight w:val="none"/>
-          <w:shd w:fill="auto" w:val="clear"/>
-        </w:rPr>
-      </w:pPr>
-      <w:r>
-        <w:rPr>
-          <w:rFonts w:ascii="times" w:hAnsi="times"/>
-          <w:sz w:val="20"/>
-          <w:szCs w:val="20"/>
-          <w:shd w:fill="auto" w:val="clear"/>
+          <w:shd w:fill="ADFF2F" w:val="clear"/>
+        </w:rPr>
+      </w:pPr>
+      <w:r>
+        <w:rPr>
+          <w:rFonts w:ascii="times" w:hAnsi="times"/>
+          <w:sz w:val="20"/>
+          <w:szCs w:val="20"/>
+          <w:shd w:fill="ADFF2F" w:val="clear"/>
         </w:rPr>
         <w:t>4. D→ b</w:t>
       </w:r>
@@ -567,23 +567,23 @@
         <w:jc w:val="start"/>
         <w:rPr>
           <w:highlight w:val="none"/>
-          <w:shd w:fill="auto" w:val="clear"/>
-        </w:rPr>
-      </w:pPr>
-      <w:r>
-        <w:rPr>
-          <w:rFonts w:ascii="times" w:hAnsi="times"/>
-          <w:sz w:val="20"/>
-          <w:szCs w:val="20"/>
-          <w:shd w:fill="auto" w:val="clear"/>
-        </w:rPr>
-        <w:t>5. E→</w:t>
-      </w:r>
-      <w:r>
-        <w:rPr>
-          <w:sz w:val="20"/>
-          <w:szCs w:val="20"/>
-          <w:shd w:fill="auto" w:val="clear"/>
+          <w:shd w:fill="ADFF2F" w:val="clear"/>
+        </w:rPr>
+      </w:pPr>
+      <w:r>
+        <w:rPr>
+          <w:rFonts w:ascii="times" w:hAnsi="times"/>
+          <w:sz w:val="20"/>
+          <w:szCs w:val="20"/>
+          <w:shd w:fill="ADFF2F" w:val="clear"/>
+        </w:rPr>
+        <w:t>5. E→</w:t>
+      </w:r>
+      <w:r>
+        <w:rPr>
+          <w:sz w:val="20"/>
+          <w:szCs w:val="20"/>
+          <w:shd w:fill="ADFF2F" w:val="clear"/>
         </w:rPr>
         <w:t>ε</w:t>
       </w:r>
@@ -595,15 +595,15 @@
         <w:jc w:val="start"/>
         <w:rPr>
           <w:highlight w:val="none"/>
-          <w:shd w:fill="auto" w:val="clear"/>
-        </w:rPr>
-      </w:pPr>
-      <w:r>
-        <w:rPr>
-          <w:rFonts w:ascii="times" w:hAnsi="times"/>
-          <w:sz w:val="20"/>
-          <w:szCs w:val="20"/>
-          <w:shd w:fill="auto" w:val="clear"/>
+          <w:shd w:fill="ADFF2F" w:val="clear"/>
+        </w:rPr>
+      </w:pPr>
+      <w:r>
+        <w:rPr>
+          <w:rFonts w:ascii="times" w:hAnsi="times"/>
+          <w:sz w:val="20"/>
+          <w:szCs w:val="20"/>
+          <w:shd w:fill="ADFF2F" w:val="clear"/>
         </w:rPr>
         <w:t>6. A→ Bbb</w:t>
       </w:r>
@@ -615,15 +615,15 @@
         <w:jc w:val="start"/>
         <w:rPr>
           <w:highlight w:val="none"/>
-          <w:shd w:fill="auto" w:val="clear"/>
-        </w:rPr>
-      </w:pPr>
-      <w:r>
-        <w:rPr>
-          <w:rFonts w:ascii="times" w:hAnsi="times"/>
-          <w:sz w:val="20"/>
-          <w:szCs w:val="20"/>
-          <w:shd w:fill="auto" w:val="clear"/>
+          <w:shd w:fill="ADFF2F" w:val="clear"/>
+        </w:rPr>
+      </w:pPr>
+      <w:r>
+        <w:rPr>
+          <w:rFonts w:ascii="times" w:hAnsi="times"/>
+          <w:sz w:val="20"/>
+          <w:szCs w:val="20"/>
+          <w:shd w:fill="ADFF2F" w:val="clear"/>
         </w:rPr>
         <w:t>7. B→ D</w:t>
       </w:r>
@@ -638,34 +638,34 @@
           <w:sz w:val="20"/>
           <w:szCs w:val="20"/>
           <w:highlight w:val="none"/>
-          <w:shd w:fill="auto" w:val="clear"/>
-        </w:rPr>
-      </w:pPr>
-      <w:r>
-        <w:rPr>
-          <w:rFonts w:ascii="times" w:hAnsi="times"/>
-          <w:sz w:val="20"/>
-          <w:szCs w:val="20"/>
-          <w:shd w:fill="auto" w:val="clear"/>
-        </w:rPr>
-      </w:r>
-    </w:p>
-    <w:p>
-      <w:pPr>
-        <w:pStyle w:val="Normal"/>
-        <w:bidi w:val="0"/>
-        <w:jc w:val="start"/>
-        <w:rPr>
-          <w:highlight w:val="none"/>
-          <w:shd w:fill="auto" w:val="clear"/>
-        </w:rPr>
-      </w:pPr>
-      <w:r>
-        <w:rPr>
-          <w:rFonts w:ascii="times" w:hAnsi="times"/>
-          <w:sz w:val="20"/>
-          <w:szCs w:val="20"/>
-          <w:shd w:fill="auto" w:val="clear"/>
+          <w:shd w:fill="ADFF2F" w:val="clear"/>
+        </w:rPr>
+      </w:pPr>
+      <w:r>
+        <w:rPr>
+          <w:rFonts w:ascii="times" w:hAnsi="times"/>
+          <w:sz w:val="20"/>
+          <w:szCs w:val="20"/>
+          <w:shd w:fill="ADFF2F" w:val="clear"/>
+        </w:rPr>
+      </w:r>
+    </w:p>
+    <w:p>
+      <w:pPr>
+        <w:pStyle w:val="Normal"/>
+        <w:bidi w:val="0"/>
+        <w:jc w:val="start"/>
+        <w:rPr>
+          <w:highlight w:val="none"/>
+          <w:shd w:fill="ADFF2F" w:val="clear"/>
+        </w:rPr>
+      </w:pPr>
+      <w:r>
+        <w:rPr>
+          <w:rFonts w:ascii="times" w:hAnsi="times"/>
+          <w:sz w:val="20"/>
+          <w:szCs w:val="20"/>
+          <w:shd w:fill="ADFF2F" w:val="clear"/>
         </w:rPr>
         <w:t>N = {T, D, E, B, A}</w:t>
       </w:r>
@@ -677,15 +677,15 @@
         <w:jc w:val="start"/>
         <w:rPr>
           <w:highlight w:val="none"/>
-          <w:shd w:fill="auto" w:val="clear"/>
-        </w:rPr>
-      </w:pPr>
-      <w:r>
-        <w:rPr>
-          <w:rFonts w:ascii="times" w:hAnsi="times"/>
-          <w:sz w:val="20"/>
-          <w:szCs w:val="20"/>
-          <w:shd w:fill="auto" w:val="clear"/>
+          <w:shd w:fill="ADFF2F" w:val="clear"/>
+        </w:rPr>
+      </w:pPr>
+      <w:r>
+        <w:rPr>
+          <w:rFonts w:ascii="times" w:hAnsi="times"/>
+          <w:sz w:val="20"/>
+          <w:szCs w:val="20"/>
+          <w:shd w:fill="ADFF2F" w:val="clear"/>
         </w:rPr>
         <w:t>D = {T, D, E, B, A}</w:t>
       </w:r>
@@ -697,15 +697,15 @@
         <w:jc w:val="start"/>
         <w:rPr>
           <w:highlight w:val="none"/>
-          <w:shd w:fill="auto" w:val="clear"/>
-        </w:rPr>
-      </w:pPr>
-      <w:r>
-        <w:rPr>
-          <w:rFonts w:ascii="times" w:hAnsi="times"/>
-          <w:sz w:val="20"/>
-          <w:szCs w:val="20"/>
-          <w:shd w:fill="auto" w:val="clear"/>
+          <w:shd w:fill="ADFF2F" w:val="clear"/>
+        </w:rPr>
+      </w:pPr>
+      <w:r>
+        <w:rPr>
+          <w:rFonts w:ascii="times" w:hAnsi="times"/>
+          <w:sz w:val="20"/>
+          <w:szCs w:val="20"/>
+          <w:shd w:fill="ADFF2F" w:val="clear"/>
         </w:rPr>
         <w:t>N — D = {}</w:t>
       </w:r>
@@ -717,15 +717,15 @@
         <w:jc w:val="start"/>
         <w:rPr>
           <w:highlight w:val="none"/>
-          <w:shd w:fill="auto" w:val="clear"/>
-        </w:rPr>
-      </w:pPr>
-      <w:r>
-        <w:rPr>
-          <w:rFonts w:ascii="times" w:hAnsi="times"/>
-          <w:sz w:val="20"/>
-          <w:szCs w:val="20"/>
-          <w:shd w:fill="auto" w:val="clear"/>
+          <w:shd w:fill="ADFF2F" w:val="clear"/>
+        </w:rPr>
+      </w:pPr>
+      <w:r>
+        <w:rPr>
+          <w:rFonts w:ascii="times" w:hAnsi="times"/>
+          <w:sz w:val="20"/>
+          <w:szCs w:val="20"/>
+          <w:shd w:fill="ADFF2F" w:val="clear"/>
         </w:rPr>
         <w:t xml:space="preserve">Из множества нетерминалов вычли P, и получили {}, это значит что недостижимых нет. </w:t>
       </w:r>
@@ -798,7 +798,7 @@
         <w:jc w:val="start"/>
         <w:rPr>
           <w:highlight w:val="none"/>
-          <w:shd w:fill="auto" w:val="clear"/>
+          <w:shd w:fill="FFFF00" w:val="clear"/>
         </w:rPr>
       </w:pPr>
       <w:r>
@@ -811,9 +811,9 @@
           <w:bCs/>
           <w:sz w:val="20"/>
           <w:szCs w:val="20"/>
-          <w:shd w:fill="auto" w:val="clear"/>
-        </w:rPr>
-        <w:t>2. Преобразовать грамматику G1 в грамматику G2 без </w:t>
+          <w:shd w:fill="FFFF00" w:val="clear"/>
+        </w:rPr>
+        <w:t xml:space="preserve">2. Преобразовать грамматику G1 в грамматику G2 без </w:t>
       </w:r>
       <w:r>
         <w:rPr>
@@ -821,7 +821,7 @@
           <w:bCs/>
           <w:sz w:val="20"/>
           <w:szCs w:val="20"/>
-          <w:shd w:fill="auto" w:val="clear"/>
+          <w:shd w:fill="FFFF00" w:val="clear"/>
         </w:rPr>
         <w:t>ε</w:t>
       </w:r>
@@ -832,7 +832,7 @@
           <w:bCs/>
           <w:sz w:val="20"/>
           <w:szCs w:val="20"/>
-          <w:shd w:fill="auto" w:val="clear"/>
+          <w:shd w:fill="FFFF00" w:val="clear"/>
         </w:rPr>
         <w:t>-правил.</w:t>
       </w:r>
@@ -844,17 +844,17 @@
         <w:jc w:val="start"/>
         <w:rPr>
           <w:highlight w:val="none"/>
-          <w:shd w:fill="auto" w:val="clear"/>
-        </w:rPr>
-      </w:pPr>
-      <w:r>
-        <w:rPr>
-          <w:rFonts w:ascii="times" w:hAnsi="times"/>
-          <w:b w:val="false"/>
-          <w:bCs w:val="false"/>
-          <w:sz w:val="20"/>
-          <w:szCs w:val="20"/>
-          <w:shd w:fill="auto" w:val="clear"/>
+          <w:shd w:fill="FFFF00" w:val="clear"/>
+        </w:rPr>
+      </w:pPr>
+      <w:r>
+        <w:rPr>
+          <w:rFonts w:ascii="times" w:hAnsi="times"/>
+          <w:b w:val="false"/>
+          <w:bCs w:val="false"/>
+          <w:sz w:val="20"/>
+          <w:szCs w:val="20"/>
+          <w:shd w:fill="FFFF00" w:val="clear"/>
         </w:rPr>
         <w:t>G1:</w:t>
       </w:r>
@@ -866,15 +866,15 @@
         <w:jc w:val="start"/>
         <w:rPr>
           <w:highlight w:val="none"/>
-          <w:shd w:fill="auto" w:val="clear"/>
-        </w:rPr>
-      </w:pPr>
-      <w:r>
-        <w:rPr>
-          <w:rFonts w:ascii="times" w:hAnsi="times"/>
-          <w:sz w:val="20"/>
-          <w:szCs w:val="20"/>
-          <w:shd w:fill="auto" w:val="clear"/>
+          <w:shd w:fill="FFFF00" w:val="clear"/>
+        </w:rPr>
+      </w:pPr>
+      <w:r>
+        <w:rPr>
+          <w:rFonts w:ascii="times" w:hAnsi="times"/>
+          <w:sz w:val="20"/>
+          <w:szCs w:val="20"/>
+          <w:shd w:fill="FFFF00" w:val="clear"/>
         </w:rPr>
         <w:t>1. T→ aDE</w:t>
       </w:r>
@@ -886,15 +886,15 @@
         <w:jc w:val="start"/>
         <w:rPr>
           <w:highlight w:val="none"/>
-          <w:shd w:fill="auto" w:val="clear"/>
-        </w:rPr>
-      </w:pPr>
-      <w:r>
-        <w:rPr>
-          <w:rFonts w:ascii="times" w:hAnsi="times"/>
-          <w:sz w:val="20"/>
-          <w:szCs w:val="20"/>
-          <w:shd w:fill="auto" w:val="clear"/>
+          <w:shd w:fill="FFFF00" w:val="clear"/>
+        </w:rPr>
+      </w:pPr>
+      <w:r>
+        <w:rPr>
+          <w:rFonts w:ascii="times" w:hAnsi="times"/>
+          <w:sz w:val="20"/>
+          <w:szCs w:val="20"/>
+          <w:shd w:fill="FFFF00" w:val="clear"/>
         </w:rPr>
         <w:t>2. T→ В</w:t>
       </w:r>
@@ -906,15 +906,15 @@
         <w:jc w:val="start"/>
         <w:rPr>
           <w:highlight w:val="none"/>
-          <w:shd w:fill="auto" w:val="clear"/>
-        </w:rPr>
-      </w:pPr>
-      <w:r>
-        <w:rPr>
-          <w:rFonts w:ascii="times" w:hAnsi="times"/>
-          <w:sz w:val="20"/>
-          <w:szCs w:val="20"/>
-          <w:shd w:fill="auto" w:val="clear"/>
+          <w:shd w:fill="FFFF00" w:val="clear"/>
+        </w:rPr>
+      </w:pPr>
+      <w:r>
+        <w:rPr>
+          <w:rFonts w:ascii="times" w:hAnsi="times"/>
+          <w:sz w:val="20"/>
+          <w:szCs w:val="20"/>
+          <w:shd w:fill="FFFF00" w:val="clear"/>
         </w:rPr>
         <w:t>3. D→ TAb</w:t>
       </w:r>
@@ -926,15 +926,15 @@
         <w:jc w:val="start"/>
         <w:rPr>
           <w:highlight w:val="none"/>
-          <w:shd w:fill="auto" w:val="clear"/>
-        </w:rPr>
-      </w:pPr>
-      <w:r>
-        <w:rPr>
-          <w:rFonts w:ascii="times" w:hAnsi="times"/>
-          <w:sz w:val="20"/>
-          <w:szCs w:val="20"/>
-          <w:shd w:fill="auto" w:val="clear"/>
+          <w:shd w:fill="FFFF00" w:val="clear"/>
+        </w:rPr>
+      </w:pPr>
+      <w:r>
+        <w:rPr>
+          <w:rFonts w:ascii="times" w:hAnsi="times"/>
+          <w:sz w:val="20"/>
+          <w:szCs w:val="20"/>
+          <w:shd w:fill="FFFF00" w:val="clear"/>
         </w:rPr>
         <w:t>4. D→ b</w:t>
       </w:r>
@@ -946,23 +946,23 @@
         <w:jc w:val="start"/>
         <w:rPr>
           <w:highlight w:val="none"/>
-          <w:shd w:fill="auto" w:val="clear"/>
-        </w:rPr>
-      </w:pPr>
-      <w:r>
-        <w:rPr>
-          <w:rFonts w:ascii="times" w:hAnsi="times"/>
-          <w:sz w:val="20"/>
-          <w:szCs w:val="20"/>
-          <w:shd w:fill="auto" w:val="clear"/>
-        </w:rPr>
-        <w:t>5. E→</w:t>
-      </w:r>
-      <w:r>
-        <w:rPr>
-          <w:sz w:val="20"/>
-          <w:szCs w:val="20"/>
-          <w:shd w:fill="auto" w:val="clear"/>
+          <w:shd w:fill="FFFF00" w:val="clear"/>
+        </w:rPr>
+      </w:pPr>
+      <w:r>
+        <w:rPr>
+          <w:rFonts w:ascii="times" w:hAnsi="times"/>
+          <w:sz w:val="20"/>
+          <w:szCs w:val="20"/>
+          <w:shd w:fill="FFFF00" w:val="clear"/>
+        </w:rPr>
+        <w:t>5. E→</w:t>
+      </w:r>
+      <w:r>
+        <w:rPr>
+          <w:sz w:val="20"/>
+          <w:szCs w:val="20"/>
+          <w:shd w:fill="FFFF00" w:val="clear"/>
         </w:rPr>
         <w:t>ε</w:t>
       </w:r>
@@ -974,15 +974,15 @@
         <w:jc w:val="start"/>
         <w:rPr>
           <w:highlight w:val="none"/>
-          <w:shd w:fill="auto" w:val="clear"/>
-        </w:rPr>
-      </w:pPr>
-      <w:r>
-        <w:rPr>
-          <w:rFonts w:ascii="times" w:hAnsi="times"/>
-          <w:sz w:val="20"/>
-          <w:szCs w:val="20"/>
-          <w:shd w:fill="auto" w:val="clear"/>
+          <w:shd w:fill="FFFF00" w:val="clear"/>
+        </w:rPr>
+      </w:pPr>
+      <w:r>
+        <w:rPr>
+          <w:rFonts w:ascii="times" w:hAnsi="times"/>
+          <w:sz w:val="20"/>
+          <w:szCs w:val="20"/>
+          <w:shd w:fill="FFFF00" w:val="clear"/>
         </w:rPr>
         <w:t>6. A→ Bbb</w:t>
       </w:r>
@@ -994,15 +994,15 @@
         <w:jc w:val="start"/>
         <w:rPr>
           <w:highlight w:val="none"/>
-          <w:shd w:fill="auto" w:val="clear"/>
-        </w:rPr>
-      </w:pPr>
-      <w:r>
-        <w:rPr>
-          <w:rFonts w:ascii="times" w:hAnsi="times"/>
-          <w:sz w:val="20"/>
-          <w:szCs w:val="20"/>
-          <w:shd w:fill="auto" w:val="clear"/>
+          <w:shd w:fill="FFFF00" w:val="clear"/>
+        </w:rPr>
+      </w:pPr>
+      <w:r>
+        <w:rPr>
+          <w:rFonts w:ascii="times" w:hAnsi="times"/>
+          <w:sz w:val="20"/>
+          <w:szCs w:val="20"/>
+          <w:shd w:fill="FFFF00" w:val="clear"/>
         </w:rPr>
         <w:t>7. B→ D</w:t>
       </w:r>
@@ -1017,34 +1017,34 @@
           <w:sz w:val="20"/>
           <w:szCs w:val="20"/>
           <w:highlight w:val="none"/>
-          <w:shd w:fill="auto" w:val="clear"/>
-        </w:rPr>
-      </w:pPr>
-      <w:r>
-        <w:rPr>
-          <w:rFonts w:ascii="times" w:hAnsi="times"/>
-          <w:sz w:val="20"/>
-          <w:szCs w:val="20"/>
-          <w:shd w:fill="auto" w:val="clear"/>
-        </w:rPr>
-      </w:r>
-    </w:p>
-    <w:p>
-      <w:pPr>
-        <w:pStyle w:val="Normal"/>
-        <w:bidi w:val="0"/>
-        <w:jc w:val="start"/>
-        <w:rPr>
-          <w:highlight w:val="none"/>
-          <w:shd w:fill="auto" w:val="clear"/>
-        </w:rPr>
-      </w:pPr>
-      <w:r>
-        <w:rPr>
-          <w:rFonts w:ascii="times" w:hAnsi="times"/>
-          <w:sz w:val="20"/>
-          <w:szCs w:val="20"/>
-          <w:shd w:fill="auto" w:val="clear"/>
+          <w:shd w:fill="FFFF00" w:val="clear"/>
+        </w:rPr>
+      </w:pPr>
+      <w:r>
+        <w:rPr>
+          <w:rFonts w:ascii="times" w:hAnsi="times"/>
+          <w:sz w:val="20"/>
+          <w:szCs w:val="20"/>
+          <w:shd w:fill="FFFF00" w:val="clear"/>
+        </w:rPr>
+      </w:r>
+    </w:p>
+    <w:p>
+      <w:pPr>
+        <w:pStyle w:val="Normal"/>
+        <w:bidi w:val="0"/>
+        <w:jc w:val="start"/>
+        <w:rPr>
+          <w:highlight w:val="none"/>
+          <w:shd w:fill="FFFF00" w:val="clear"/>
+        </w:rPr>
+      </w:pPr>
+      <w:r>
+        <w:rPr>
+          <w:rFonts w:ascii="times" w:hAnsi="times"/>
+          <w:sz w:val="20"/>
+          <w:szCs w:val="20"/>
+          <w:shd w:fill="FFFF00" w:val="clear"/>
         </w:rPr>
         <w:t>Исключаем правило 5.</w:t>
       </w:r>
@@ -1056,15 +1056,15 @@
         <w:jc w:val="start"/>
         <w:rPr>
           <w:highlight w:val="none"/>
-          <w:shd w:fill="auto" w:val="clear"/>
-        </w:rPr>
-      </w:pPr>
-      <w:r>
-        <w:rPr>
-          <w:rFonts w:ascii="times" w:hAnsi="times"/>
-          <w:sz w:val="20"/>
-          <w:szCs w:val="20"/>
-          <w:shd w:fill="auto" w:val="clear"/>
+          <w:shd w:fill="FFFF00" w:val="clear"/>
+        </w:rPr>
+      </w:pPr>
+      <w:r>
+        <w:rPr>
+          <w:rFonts w:ascii="times" w:hAnsi="times"/>
+          <w:sz w:val="20"/>
+          <w:szCs w:val="20"/>
+          <w:shd w:fill="FFFF00" w:val="clear"/>
         </w:rPr>
         <w:t>Получим:</w:t>
       </w:r>
@@ -1079,34 +1079,34 @@
           <w:sz w:val="20"/>
           <w:szCs w:val="20"/>
           <w:highlight w:val="none"/>
-          <w:shd w:fill="auto" w:val="clear"/>
-        </w:rPr>
-      </w:pPr>
-      <w:r>
-        <w:rPr>
-          <w:rFonts w:ascii="times" w:hAnsi="times"/>
-          <w:sz w:val="20"/>
-          <w:szCs w:val="20"/>
-          <w:shd w:fill="auto" w:val="clear"/>
-        </w:rPr>
-      </w:r>
-    </w:p>
-    <w:p>
-      <w:pPr>
-        <w:pStyle w:val="Normal"/>
-        <w:bidi w:val="0"/>
-        <w:jc w:val="start"/>
-        <w:rPr>
-          <w:highlight w:val="none"/>
-          <w:shd w:fill="auto" w:val="clear"/>
-        </w:rPr>
-      </w:pPr>
-      <w:r>
-        <w:rPr>
-          <w:rFonts w:ascii="times" w:hAnsi="times"/>
-          <w:sz w:val="20"/>
-          <w:szCs w:val="20"/>
-          <w:shd w:fill="auto" w:val="clear"/>
+          <w:shd w:fill="FFFF00" w:val="clear"/>
+        </w:rPr>
+      </w:pPr>
+      <w:r>
+        <w:rPr>
+          <w:rFonts w:ascii="times" w:hAnsi="times"/>
+          <w:sz w:val="20"/>
+          <w:szCs w:val="20"/>
+          <w:shd w:fill="FFFF00" w:val="clear"/>
+        </w:rPr>
+      </w:r>
+    </w:p>
+    <w:p>
+      <w:pPr>
+        <w:pStyle w:val="Normal"/>
+        <w:bidi w:val="0"/>
+        <w:jc w:val="start"/>
+        <w:rPr>
+          <w:highlight w:val="none"/>
+          <w:shd w:fill="FFFF00" w:val="clear"/>
+        </w:rPr>
+      </w:pPr>
+      <w:r>
+        <w:rPr>
+          <w:rFonts w:ascii="times" w:hAnsi="times"/>
+          <w:sz w:val="20"/>
+          <w:szCs w:val="20"/>
+          <w:shd w:fill="FFFF00" w:val="clear"/>
         </w:rPr>
         <w:t>1. T→ aDE</w:t>
       </w:r>
@@ -1118,15 +1118,15 @@
         <w:jc w:val="start"/>
         <w:rPr>
           <w:highlight w:val="none"/>
-          <w:shd w:fill="auto" w:val="clear"/>
-        </w:rPr>
-      </w:pPr>
-      <w:r>
-        <w:rPr>
-          <w:rFonts w:ascii="times" w:hAnsi="times"/>
-          <w:sz w:val="20"/>
-          <w:szCs w:val="20"/>
-          <w:shd w:fill="auto" w:val="clear"/>
+          <w:shd w:fill="FFFF00" w:val="clear"/>
+        </w:rPr>
+      </w:pPr>
+      <w:r>
+        <w:rPr>
+          <w:rFonts w:ascii="times" w:hAnsi="times"/>
+          <w:sz w:val="20"/>
+          <w:szCs w:val="20"/>
+          <w:shd w:fill="FFFF00" w:val="clear"/>
         </w:rPr>
         <w:t xml:space="preserve">    </w:t>
       </w:r>
@@ -1135,7 +1135,7 @@
           <w:rFonts w:ascii="times" w:hAnsi="times"/>
           <w:sz w:val="20"/>
           <w:szCs w:val="20"/>
-          <w:shd w:fill="auto" w:val="clear"/>
+          <w:shd w:fill="FFFF00" w:val="clear"/>
         </w:rPr>
         <w:t>T → aD</w:t>
       </w:r>
@@ -1147,15 +1147,15 @@
         <w:jc w:val="start"/>
         <w:rPr>
           <w:highlight w:val="none"/>
-          <w:shd w:fill="auto" w:val="clear"/>
-        </w:rPr>
-      </w:pPr>
-      <w:r>
-        <w:rPr>
-          <w:rFonts w:ascii="times" w:hAnsi="times"/>
-          <w:sz w:val="20"/>
-          <w:szCs w:val="20"/>
-          <w:shd w:fill="auto" w:val="clear"/>
+          <w:shd w:fill="FFFF00" w:val="clear"/>
+        </w:rPr>
+      </w:pPr>
+      <w:r>
+        <w:rPr>
+          <w:rFonts w:ascii="times" w:hAnsi="times"/>
+          <w:sz w:val="20"/>
+          <w:szCs w:val="20"/>
+          <w:shd w:fill="FFFF00" w:val="clear"/>
         </w:rPr>
         <w:t>2. T→ В</w:t>
       </w:r>
@@ -1167,15 +1167,15 @@
         <w:jc w:val="start"/>
         <w:rPr>
           <w:highlight w:val="none"/>
-          <w:shd w:fill="auto" w:val="clear"/>
-        </w:rPr>
-      </w:pPr>
-      <w:r>
-        <w:rPr>
-          <w:rFonts w:ascii="times" w:hAnsi="times"/>
-          <w:sz w:val="20"/>
-          <w:szCs w:val="20"/>
-          <w:shd w:fill="auto" w:val="clear"/>
+          <w:shd w:fill="FFFF00" w:val="clear"/>
+        </w:rPr>
+      </w:pPr>
+      <w:r>
+        <w:rPr>
+          <w:rFonts w:ascii="times" w:hAnsi="times"/>
+          <w:sz w:val="20"/>
+          <w:szCs w:val="20"/>
+          <w:shd w:fill="FFFF00" w:val="clear"/>
         </w:rPr>
         <w:t>3. D→ TAb</w:t>
       </w:r>
@@ -1187,15 +1187,15 @@
         <w:jc w:val="start"/>
         <w:rPr>
           <w:highlight w:val="none"/>
-          <w:shd w:fill="auto" w:val="clear"/>
-        </w:rPr>
-      </w:pPr>
-      <w:r>
-        <w:rPr>
-          <w:rFonts w:ascii="times" w:hAnsi="times"/>
-          <w:sz w:val="20"/>
-          <w:szCs w:val="20"/>
-          <w:shd w:fill="auto" w:val="clear"/>
+          <w:shd w:fill="FFFF00" w:val="clear"/>
+        </w:rPr>
+      </w:pPr>
+      <w:r>
+        <w:rPr>
+          <w:rFonts w:ascii="times" w:hAnsi="times"/>
+          <w:sz w:val="20"/>
+          <w:szCs w:val="20"/>
+          <w:shd w:fill="FFFF00" w:val="clear"/>
         </w:rPr>
         <w:t>4. D→ b</w:t>
       </w:r>
@@ -1207,15 +1207,15 @@
         <w:jc w:val="start"/>
         <w:rPr>
           <w:highlight w:val="none"/>
-          <w:shd w:fill="auto" w:val="clear"/>
-        </w:rPr>
-      </w:pPr>
-      <w:r>
-        <w:rPr>
-          <w:rFonts w:ascii="times" w:hAnsi="times"/>
-          <w:sz w:val="20"/>
-          <w:szCs w:val="20"/>
-          <w:shd w:fill="auto" w:val="clear"/>
+          <w:shd w:fill="FFFF00" w:val="clear"/>
+        </w:rPr>
+      </w:pPr>
+      <w:r>
+        <w:rPr>
+          <w:rFonts w:ascii="times" w:hAnsi="times"/>
+          <w:sz w:val="20"/>
+          <w:szCs w:val="20"/>
+          <w:shd w:fill="FFFF00" w:val="clear"/>
         </w:rPr>
         <w:t>6. A→ Bbb</w:t>
       </w:r>
@@ -1227,15 +1227,15 @@
         <w:jc w:val="start"/>
         <w:rPr>
           <w:highlight w:val="none"/>
-          <w:shd w:fill="auto" w:val="clear"/>
-        </w:rPr>
-      </w:pPr>
-      <w:r>
-        <w:rPr>
-          <w:rFonts w:ascii="times" w:hAnsi="times"/>
-          <w:sz w:val="20"/>
-          <w:szCs w:val="20"/>
-          <w:shd w:fill="auto" w:val="clear"/>
+          <w:shd w:fill="FFFF00" w:val="clear"/>
+        </w:rPr>
+      </w:pPr>
+      <w:r>
+        <w:rPr>
+          <w:rFonts w:ascii="times" w:hAnsi="times"/>
+          <w:sz w:val="20"/>
+          <w:szCs w:val="20"/>
+          <w:shd w:fill="FFFF00" w:val="clear"/>
         </w:rPr>
         <w:t>7. B→ D</w:t>
       </w:r>
@@ -1250,34 +1250,34 @@
           <w:sz w:val="20"/>
           <w:szCs w:val="20"/>
           <w:highlight w:val="none"/>
-          <w:shd w:fill="auto" w:val="clear"/>
-        </w:rPr>
-      </w:pPr>
-      <w:r>
-        <w:rPr>
-          <w:rFonts w:ascii="times" w:hAnsi="times"/>
-          <w:sz w:val="20"/>
-          <w:szCs w:val="20"/>
-          <w:shd w:fill="auto" w:val="clear"/>
-        </w:rPr>
-      </w:r>
-    </w:p>
-    <w:p>
-      <w:pPr>
-        <w:pStyle w:val="Normal"/>
-        <w:bidi w:val="0"/>
-        <w:jc w:val="start"/>
-        <w:rPr>
-          <w:highlight w:val="none"/>
-          <w:shd w:fill="auto" w:val="clear"/>
-        </w:rPr>
-      </w:pPr>
-      <w:r>
-        <w:rPr>
-          <w:rFonts w:ascii="times" w:hAnsi="times"/>
-          <w:sz w:val="20"/>
-          <w:szCs w:val="20"/>
-          <w:shd w:fill="auto" w:val="clear"/>
+          <w:shd w:fill="FFFF00" w:val="clear"/>
+        </w:rPr>
+      </w:pPr>
+      <w:r>
+        <w:rPr>
+          <w:rFonts w:ascii="times" w:hAnsi="times"/>
+          <w:sz w:val="20"/>
+          <w:szCs w:val="20"/>
+          <w:shd w:fill="FFFF00" w:val="clear"/>
+        </w:rPr>
+      </w:r>
+    </w:p>
+    <w:p>
+      <w:pPr>
+        <w:pStyle w:val="Normal"/>
+        <w:bidi w:val="0"/>
+        <w:jc w:val="start"/>
+        <w:rPr>
+          <w:highlight w:val="none"/>
+          <w:shd w:fill="FFFF00" w:val="clear"/>
+        </w:rPr>
+      </w:pPr>
+      <w:r>
+        <w:rPr>
+          <w:rFonts w:ascii="times" w:hAnsi="times"/>
+          <w:sz w:val="20"/>
+          <w:szCs w:val="20"/>
+          <w:shd w:fill="FFFF00" w:val="clear"/>
         </w:rPr>
         <w:t>Исключим непродуктивные символы. В G2 нет правил вида A → A, одинаковых правил и эпсилон правил.</w:t>
       </w:r>
@@ -1289,7 +1289,7 @@
         <w:jc w:val="start"/>
         <w:rPr>
           <w:highlight w:val="none"/>
-          <w:shd w:fill="auto" w:val="clear"/>
+          <w:shd w:fill="FFFF00" w:val="clear"/>
         </w:rPr>
       </w:pPr>
       <w:r>
@@ -1299,7 +1299,7 @@
           <w:bCs/>
           <w:sz w:val="20"/>
           <w:szCs w:val="20"/>
-          <w:shd w:fill="auto" w:val="clear"/>
+          <w:shd w:fill="FFFF00" w:val="clear"/>
         </w:rPr>
         <w:t>G2:</w:t>
       </w:r>
@@ -1311,15 +1311,15 @@
         <w:jc w:val="start"/>
         <w:rPr>
           <w:highlight w:val="none"/>
-          <w:shd w:fill="auto" w:val="clear"/>
-        </w:rPr>
-      </w:pPr>
-      <w:r>
-        <w:rPr>
-          <w:rFonts w:ascii="times" w:hAnsi="times"/>
-          <w:sz w:val="20"/>
-          <w:szCs w:val="20"/>
-          <w:shd w:fill="auto" w:val="clear"/>
+          <w:shd w:fill="FFFF00" w:val="clear"/>
+        </w:rPr>
+      </w:pPr>
+      <w:r>
+        <w:rPr>
+          <w:rFonts w:ascii="times" w:hAnsi="times"/>
+          <w:sz w:val="20"/>
+          <w:szCs w:val="20"/>
+          <w:shd w:fill="FFFF00" w:val="clear"/>
         </w:rPr>
         <w:t>1. T → aD</w:t>
       </w:r>
@@ -1331,15 +1331,15 @@
         <w:jc w:val="start"/>
         <w:rPr>
           <w:highlight w:val="none"/>
-          <w:shd w:fill="auto" w:val="clear"/>
-        </w:rPr>
-      </w:pPr>
-      <w:r>
-        <w:rPr>
-          <w:rFonts w:ascii="times" w:hAnsi="times"/>
-          <w:sz w:val="20"/>
-          <w:szCs w:val="20"/>
-          <w:shd w:fill="auto" w:val="clear"/>
+          <w:shd w:fill="FFFF00" w:val="clear"/>
+        </w:rPr>
+      </w:pPr>
+      <w:r>
+        <w:rPr>
+          <w:rFonts w:ascii="times" w:hAnsi="times"/>
+          <w:sz w:val="20"/>
+          <w:szCs w:val="20"/>
+          <w:shd w:fill="FFFF00" w:val="clear"/>
         </w:rPr>
         <w:t>2. T → В</w:t>
       </w:r>
@@ -1351,15 +1351,15 @@
         <w:jc w:val="start"/>
         <w:rPr>
           <w:highlight w:val="none"/>
-          <w:shd w:fill="auto" w:val="clear"/>
-        </w:rPr>
-      </w:pPr>
-      <w:r>
-        <w:rPr>
-          <w:rFonts w:ascii="times" w:hAnsi="times"/>
-          <w:sz w:val="20"/>
-          <w:szCs w:val="20"/>
-          <w:shd w:fill="auto" w:val="clear"/>
+          <w:shd w:fill="FFFF00" w:val="clear"/>
+        </w:rPr>
+      </w:pPr>
+      <w:r>
+        <w:rPr>
+          <w:rFonts w:ascii="times" w:hAnsi="times"/>
+          <w:sz w:val="20"/>
+          <w:szCs w:val="20"/>
+          <w:shd w:fill="FFFF00" w:val="clear"/>
         </w:rPr>
         <w:t>3. D → TAb</w:t>
       </w:r>
@@ -1371,15 +1371,15 @@
         <w:jc w:val="start"/>
         <w:rPr>
           <w:highlight w:val="none"/>
-          <w:shd w:fill="auto" w:val="clear"/>
-        </w:rPr>
-      </w:pPr>
-      <w:r>
-        <w:rPr>
-          <w:rFonts w:ascii="times" w:hAnsi="times"/>
-          <w:sz w:val="20"/>
-          <w:szCs w:val="20"/>
-          <w:shd w:fill="auto" w:val="clear"/>
+          <w:shd w:fill="FFFF00" w:val="clear"/>
+        </w:rPr>
+      </w:pPr>
+      <w:r>
+        <w:rPr>
+          <w:rFonts w:ascii="times" w:hAnsi="times"/>
+          <w:sz w:val="20"/>
+          <w:szCs w:val="20"/>
+          <w:shd w:fill="FFFF00" w:val="clear"/>
         </w:rPr>
         <w:t>4. D → b</w:t>
       </w:r>
@@ -1391,15 +1391,15 @@
         <w:jc w:val="start"/>
         <w:rPr>
           <w:highlight w:val="none"/>
-          <w:shd w:fill="auto" w:val="clear"/>
-        </w:rPr>
-      </w:pPr>
-      <w:r>
-        <w:rPr>
-          <w:rFonts w:ascii="times" w:hAnsi="times"/>
-          <w:sz w:val="20"/>
-          <w:szCs w:val="20"/>
-          <w:shd w:fill="auto" w:val="clear"/>
+          <w:shd w:fill="FFFF00" w:val="clear"/>
+        </w:rPr>
+      </w:pPr>
+      <w:r>
+        <w:rPr>
+          <w:rFonts w:ascii="times" w:hAnsi="times"/>
+          <w:sz w:val="20"/>
+          <w:szCs w:val="20"/>
+          <w:shd w:fill="FFFF00" w:val="clear"/>
         </w:rPr>
         <w:t>6. A→ Bbb</w:t>
       </w:r>
@@ -1411,15 +1411,15 @@
         <w:jc w:val="start"/>
         <w:rPr>
           <w:highlight w:val="none"/>
-          <w:shd w:fill="auto" w:val="clear"/>
-        </w:rPr>
-      </w:pPr>
-      <w:r>
-        <w:rPr>
-          <w:rFonts w:ascii="times" w:hAnsi="times"/>
-          <w:sz w:val="20"/>
-          <w:szCs w:val="20"/>
-          <w:shd w:fill="auto" w:val="clear"/>
+          <w:shd w:fill="FFFF00" w:val="clear"/>
+        </w:rPr>
+      </w:pPr>
+      <w:r>
+        <w:rPr>
+          <w:rFonts w:ascii="times" w:hAnsi="times"/>
+          <w:sz w:val="20"/>
+          <w:szCs w:val="20"/>
+          <w:shd w:fill="FFFF00" w:val="clear"/>
         </w:rPr>
         <w:t>7. B → D</w:t>
       </w:r>
@@ -1649,7 +1649,7 @@
           <w:szCs w:val="20"/>
           <w:shd w:fill="auto" w:val="clear"/>
         </w:rPr>
-        <w:t>5. E→</w:t>
+        <w:t>5. E→</w:t>
       </w:r>
       <w:r>
         <w:rPr>
@@ -2086,7 +2086,7 @@
           <w:szCs w:val="20"/>
           <w:shd w:fill="auto" w:val="clear"/>
         </w:rPr>
-        <w:t>4. E→</w:t>
+        <w:t>4. E→</w:t>
       </w:r>
       <w:r>
         <w:rPr>
@@ -2632,7 +2632,7 @@
           <w:szCs w:val="20"/>
           <w:shd w:fill="auto" w:val="clear"/>
         </w:rPr>
-        <w:t>6. E→</w:t>
+        <w:t>6. E→</w:t>
       </w:r>
       <w:r>
         <w:rPr>
@@ -2889,7 +2889,7 @@
           <w:szCs w:val="20"/>
           <w:shd w:fill="auto" w:val="clear"/>
         </w:rPr>
-        <w:t>5. E→</w:t>
+        <w:t>5. E→</w:t>
       </w:r>
       <w:r>
         <w:rPr>
@@ -3116,7 +3116,7 @@
           <w:szCs w:val="20"/>
           <w:shd w:fill="auto" w:val="clear"/>
         </w:rPr>
-        <w:t>6. E→</w:t>
+        <w:t>6. E→</w:t>
       </w:r>
       <w:r>
         <w:rPr>
@@ -5116,7 +5116,7 @@
           <w:szCs w:val="20"/>
           <w:shd w:fill="auto" w:val="clear"/>
         </w:rPr>
-        <w:t>5. E→</w:t>
+        <w:t>5. E→</w:t>
       </w:r>
       <w:r>
         <w:rPr>
@@ -7560,15 +7560,7 @@
           <w:szCs w:val="20"/>
           <w:shd w:fill="auto" w:val="clear"/>
         </w:rPr>
-        <w:t xml:space="preserve">3. T → </w:t>
-      </w:r>
-      <w:r>
-        <w:rPr>
-          <w:sz w:val="20"/>
-          <w:szCs w:val="20"/>
-          <w:shd w:fill="auto" w:val="clear"/>
-        </w:rPr>
-        <w:t>b</w:t>
+        <w:t>3. T → b</w:t>
       </w:r>
     </w:p>
     <w:p>
@@ -7612,15 +7604,7 @@
           <w:szCs w:val="20"/>
           <w:shd w:fill="auto" w:val="clear"/>
         </w:rPr>
-        <w:t xml:space="preserve">5. D → </w:t>
-      </w:r>
-      <w:r>
-        <w:rPr>
-          <w:sz w:val="20"/>
-          <w:szCs w:val="20"/>
-          <w:shd w:fill="auto" w:val="clear"/>
-        </w:rPr>
-        <w:t>b</w:t>
+        <w:t>5. D → b</w:t>
       </w:r>
     </w:p>
     <w:p>
@@ -7686,15 +7670,7 @@
           <w:szCs w:val="20"/>
           <w:shd w:fill="auto" w:val="clear"/>
         </w:rPr>
-        <w:t xml:space="preserve">8. B → </w:t>
-      </w:r>
-      <w:r>
-        <w:rPr>
-          <w:sz w:val="20"/>
-          <w:szCs w:val="20"/>
-          <w:shd w:fill="auto" w:val="clear"/>
-        </w:rPr>
-        <w:t>b</w:t>
+        <w:t>8. B → b</w:t>
       </w:r>
     </w:p>
     <w:p>

</xml_diff>